<commit_message>
week 6 completed [Amit Goyal]
</commit_message>
<xml_diff>
--- a/WEEK-6/Git-HOL-1.docx
+++ b/WEEK-6/Git-HOL-1.docx
@@ -115,39 +115,7 @@
           <w:szCs w:val="52"/>
           <w:lang w:val="en-IN"/>
         </w:rPr>
-        <w:t xml:space="preserve">git config --global </w:t>
-      </w:r>
-      <w:proofErr w:type="spellStart"/>
-      <w:proofErr w:type="gramStart"/>
-      <w:r>
-        <w:rPr>
-          <w:rFonts w:asciiTheme="majorHAnsi" w:eastAsiaTheme="majorEastAsia" w:hAnsiTheme="majorHAnsi" w:cstheme="majorBidi"/>
-          <w:b/>
-          <w:bCs/>
-          <w:color w:val="17365D" w:themeColor="text2" w:themeShade="BF"/>
-          <w:spacing w:val="5"/>
-          <w:kern w:val="28"/>
-          <w:sz w:val="52"/>
-          <w:szCs w:val="52"/>
-          <w:lang w:val="en-IN"/>
-        </w:rPr>
-        <w:t>user.email</w:t>
-      </w:r>
-      <w:proofErr w:type="spellEnd"/>
-      <w:proofErr w:type="gramEnd"/>
-      <w:r>
-        <w:rPr>
-          <w:rFonts w:asciiTheme="majorHAnsi" w:eastAsiaTheme="majorEastAsia" w:hAnsiTheme="majorHAnsi" w:cstheme="majorBidi"/>
-          <w:b/>
-          <w:bCs/>
-          <w:color w:val="17365D" w:themeColor="text2" w:themeShade="BF"/>
-          <w:spacing w:val="5"/>
-          <w:kern w:val="28"/>
-          <w:sz w:val="52"/>
-          <w:szCs w:val="52"/>
-          <w:lang w:val="en-IN"/>
-        </w:rPr>
-        <w:t xml:space="preserve"> "youremail@gmail.com"</w:t>
+        <w:t>git config --global user.email "youremail@gmail.com"</w:t>
       </w:r>
     </w:p>
     <w:p>
@@ -169,10 +137,10 @@
           <w:noProof/>
         </w:rPr>
         <w:drawing>
-          <wp:inline distT="0" distB="0" distL="0" distR="0" wp14:anchorId="4A4A8EAC" wp14:editId="28774196">
+          <wp:inline distT="0" distB="0" distL="0" distR="0" wp14:anchorId="2FF65D48" wp14:editId="2F8B574A">
             <wp:extent cx="5486400" cy="3086100"/>
             <wp:effectExtent l="0" t="0" r="0" b="0"/>
-            <wp:docPr id="928789387" name="Picture 1"/>
+            <wp:docPr id="1917603979" name="Picture 1"/>
             <wp:cNvGraphicFramePr>
               <a:graphicFrameLocks xmlns:a="http://schemas.openxmlformats.org/drawingml/2006/main" noChangeAspect="1"/>
             </wp:cNvGraphicFramePr>
@@ -180,7 +148,7 @@
               <a:graphicData uri="http://schemas.openxmlformats.org/drawingml/2006/picture">
                 <pic:pic xmlns:pic="http://schemas.openxmlformats.org/drawingml/2006/picture">
                   <pic:nvPicPr>
-                    <pic:cNvPr id="928789387" name=""/>
+                    <pic:cNvPr id="1917603979" name=""/>
                     <pic:cNvPicPr/>
                   </pic:nvPicPr>
                   <pic:blipFill>
@@ -232,7 +200,7 @@
           <w:lang w:val="en-IN"/>
         </w:rPr>
         <w:pict w14:anchorId="37690F8B">
-          <v:rect id="_x0000_i1289" style="width:0;height:1.5pt" o:hralign="center" o:hrstd="t" o:hr="t" fillcolor="#a0a0a0" stroked="f"/>
+          <v:rect id="_x0000_i1025" style="width:0;height:1.5pt" o:hralign="center" o:hrstd="t" o:hr="t" fillcolor="#a0a0a0" stroked="f"/>
         </w:pict>
       </w:r>
     </w:p>
@@ -343,10 +311,10 @@
           <w:noProof/>
         </w:rPr>
         <w:drawing>
-          <wp:inline distT="0" distB="0" distL="0" distR="0" wp14:anchorId="457D8037" wp14:editId="47A34D3F">
+          <wp:inline distT="0" distB="0" distL="0" distR="0" wp14:anchorId="196DF130" wp14:editId="6316E97F">
             <wp:extent cx="5486400" cy="3086100"/>
             <wp:effectExtent l="0" t="0" r="0" b="0"/>
-            <wp:docPr id="502279755" name="Picture 1"/>
+            <wp:docPr id="781317198" name="Picture 1"/>
             <wp:cNvGraphicFramePr>
               <a:graphicFrameLocks xmlns:a="http://schemas.openxmlformats.org/drawingml/2006/main" noChangeAspect="1"/>
             </wp:cNvGraphicFramePr>
@@ -354,7 +322,7 @@
               <a:graphicData uri="http://schemas.openxmlformats.org/drawingml/2006/picture">
                 <pic:pic xmlns:pic="http://schemas.openxmlformats.org/drawingml/2006/picture">
                   <pic:nvPicPr>
-                    <pic:cNvPr id="502279755" name=""/>
+                    <pic:cNvPr id="781317198" name=""/>
                     <pic:cNvPicPr/>
                   </pic:nvPicPr>
                   <pic:blipFill>
@@ -391,7 +359,7 @@
           <w:lang w:val="en-IN"/>
         </w:rPr>
         <w:pict w14:anchorId="54861B0A">
-          <v:rect id="_x0000_i1290" style="width:0;height:1.5pt" o:hralign="center" o:hrstd="t" o:hr="t" fillcolor="#a0a0a0" stroked="f"/>
+          <v:rect id="_x0000_i1026" style="width:0;height:1.5pt" o:hralign="center" o:hrstd="t" o:hr="t" fillcolor="#a0a0a0" stroked="f"/>
         </w:pict>
       </w:r>
     </w:p>
@@ -438,7 +406,6 @@
           <w:lang w:val="en-IN"/>
         </w:rPr>
       </w:pPr>
-      <w:proofErr w:type="spellStart"/>
       <w:r>
         <w:rPr>
           <w:rFonts w:asciiTheme="majorHAnsi" w:eastAsiaTheme="majorEastAsia" w:hAnsiTheme="majorHAnsi" w:cstheme="majorBidi"/>
@@ -451,39 +418,8 @@
           <w:szCs w:val="52"/>
           <w:lang w:val="en-IN"/>
         </w:rPr>
-        <w:t>mkdir</w:t>
+        <w:t>mkdir GitDemo</w:t>
       </w:r>
-      <w:proofErr w:type="spellEnd"/>
-      <w:r>
-        <w:rPr>
-          <w:rFonts w:asciiTheme="majorHAnsi" w:eastAsiaTheme="majorEastAsia" w:hAnsiTheme="majorHAnsi" w:cstheme="majorBidi"/>
-          <w:b/>
-          <w:bCs/>
-          <w:color w:val="17365D" w:themeColor="text2" w:themeShade="BF"/>
-          <w:spacing w:val="5"/>
-          <w:kern w:val="28"/>
-          <w:sz w:val="52"/>
-          <w:szCs w:val="52"/>
-          <w:lang w:val="en-IN"/>
-        </w:rPr>
-        <w:t xml:space="preserve"> </w:t>
-      </w:r>
-      <w:proofErr w:type="spellStart"/>
-      <w:r>
-        <w:rPr>
-          <w:rFonts w:asciiTheme="majorHAnsi" w:eastAsiaTheme="majorEastAsia" w:hAnsiTheme="majorHAnsi" w:cstheme="majorBidi"/>
-          <w:b/>
-          <w:bCs/>
-          <w:color w:val="17365D" w:themeColor="text2" w:themeShade="BF"/>
-          <w:spacing w:val="5"/>
-          <w:kern w:val="28"/>
-          <w:sz w:val="52"/>
-          <w:szCs w:val="52"/>
-          <w:lang w:val="en-IN"/>
-        </w:rPr>
-        <w:t>GitDemo</w:t>
-      </w:r>
-      <w:proofErr w:type="spellEnd"/>
     </w:p>
     <w:p>
       <w:pPr>
@@ -511,24 +447,8 @@
           <w:szCs w:val="52"/>
           <w:lang w:val="en-IN"/>
         </w:rPr>
-        <w:t xml:space="preserve">cd </w:t>
+        <w:t>cd GitDemo</w:t>
       </w:r>
-      <w:proofErr w:type="spellStart"/>
-      <w:r>
-        <w:rPr>
-          <w:rFonts w:asciiTheme="majorHAnsi" w:eastAsiaTheme="majorEastAsia" w:hAnsiTheme="majorHAnsi" w:cstheme="majorBidi"/>
-          <w:b/>
-          <w:bCs/>
-          <w:color w:val="17365D" w:themeColor="text2" w:themeShade="BF"/>
-          <w:spacing w:val="5"/>
-          <w:kern w:val="28"/>
-          <w:sz w:val="52"/>
-          <w:szCs w:val="52"/>
-          <w:lang w:val="en-IN"/>
-        </w:rPr>
-        <w:t>GitDemo</w:t>
-      </w:r>
-      <w:proofErr w:type="spellEnd"/>
     </w:p>
     <w:p>
       <w:pPr>
@@ -556,24 +476,8 @@
           <w:szCs w:val="52"/>
           <w:lang w:val="en-IN"/>
         </w:rPr>
-        <w:t xml:space="preserve">git </w:t>
+        <w:t>git init</w:t>
       </w:r>
-      <w:proofErr w:type="spellStart"/>
-      <w:r>
-        <w:rPr>
-          <w:rFonts w:asciiTheme="majorHAnsi" w:eastAsiaTheme="majorEastAsia" w:hAnsiTheme="majorHAnsi" w:cstheme="majorBidi"/>
-          <w:b/>
-          <w:bCs/>
-          <w:color w:val="17365D" w:themeColor="text2" w:themeShade="BF"/>
-          <w:spacing w:val="5"/>
-          <w:kern w:val="28"/>
-          <w:sz w:val="52"/>
-          <w:szCs w:val="52"/>
-          <w:lang w:val="en-IN"/>
-        </w:rPr>
-        <w:t>init</w:t>
-      </w:r>
-      <w:proofErr w:type="spellEnd"/>
     </w:p>
     <w:p>
       <w:pPr>
@@ -643,7 +547,7 @@
           <w:lang w:val="en-IN"/>
         </w:rPr>
         <w:pict w14:anchorId="37C83CC7">
-          <v:rect id="_x0000_i1291" style="width:0;height:1.5pt" o:hralign="center" o:hrstd="t" o:hr="t" fillcolor="#a0a0a0" stroked="f"/>
+          <v:rect id="_x0000_i1027" style="width:0;height:1.5pt" o:hralign="center" o:hrstd="t" o:hr="t" fillcolor="#a0a0a0" stroked="f"/>
         </w:pict>
       </w:r>
     </w:p>
@@ -831,7 +735,7 @@
           <w:lang w:val="en-IN"/>
         </w:rPr>
         <w:pict w14:anchorId="17D07896">
-          <v:rect id="_x0000_i1292" style="width:0;height:1.5pt" o:hralign="center" o:hrstd="t" o:hr="t" fillcolor="#a0a0a0" stroked="f"/>
+          <v:rect id="_x0000_i1028" style="width:0;height:1.5pt" o:hralign="center" o:hrstd="t" o:hr="t" fillcolor="#a0a0a0" stroked="f"/>
         </w:pict>
       </w:r>
     </w:p>
@@ -1019,7 +923,7 @@
           <w:lang w:val="en-IN"/>
         </w:rPr>
         <w:pict w14:anchorId="33AEC140">
-          <v:rect id="_x0000_i1293" style="width:0;height:1.5pt" o:hralign="center" o:hrstd="t" o:hr="t" fillcolor="#a0a0a0" stroked="f"/>
+          <v:rect id="_x0000_i1029" style="width:0;height:1.5pt" o:hralign="center" o:hrstd="t" o:hr="t" fillcolor="#a0a0a0" stroked="f"/>
         </w:pict>
       </w:r>
     </w:p>
@@ -1178,7 +1082,7 @@
           <w:lang w:val="en-IN"/>
         </w:rPr>
         <w:pict w14:anchorId="523874EA">
-          <v:rect id="_x0000_i1294" style="width:0;height:1.5pt" o:hralign="center" o:hrstd="t" o:hr="t" fillcolor="#a0a0a0" stroked="f"/>
+          <v:rect id="_x0000_i1030" style="width:0;height:1.5pt" o:hralign="center" o:hrstd="t" o:hr="t" fillcolor="#a0a0a0" stroked="f"/>
         </w:pict>
       </w:r>
     </w:p>
@@ -2280,6 +2184,7 @@
   <w:style w:type="character" w:default="1" w:styleId="DefaultParagraphFont">
     <w:name w:val="Default Paragraph Font"/>
     <w:uiPriority w:val="1"/>
+    <w:semiHidden/>
     <w:unhideWhenUsed/>
   </w:style>
   <w:style w:type="table" w:default="1" w:styleId="TableNormal">

</xml_diff>